<commit_message>
feat: sync 2026-09-22 TP swim workout (3400m sweet spot) and update dashboard
</commit_message>
<xml_diff>
--- a/docs/weekly/2026-W39_當週執行率回顧報告.docx
+++ b/docs/weekly/2026-W39_當週執行率回顧報告.docx
@@ -21,7 +21,7 @@
           <w:color w:val="555555"/>
           <w:sz w:val="20"/>
         </w:rPr>
-        <w:t>週期：2026/09/21–2026/09/27　｜　整體時間執行率：0.0%</w:t>
+        <w:t>週期：2026/09/21–2026/09/27　｜　整體時間執行率：12.7%</w:t>
       </w:r>
     </w:p>
     <w:p>
@@ -347,7 +347,7 @@
                 <w:color w:val="000000"/>
                 <w:sz w:val="19"/>
               </w:rPr>
-              <w:t>0.00 hr</w:t>
+              <w:t>1.05 hr</w:t>
             </w:r>
           </w:p>
         </w:tc>
@@ -374,7 +374,7 @@
                 <w:color w:val="000000"/>
                 <w:sz w:val="19"/>
               </w:rPr>
-              <w:t>0.0%</w:t>
+              <w:t>42.0%</w:t>
             </w:r>
           </w:p>
         </w:tc>
@@ -428,7 +428,7 @@
                 <w:color w:val="000000"/>
                 <w:sz w:val="19"/>
               </w:rPr>
-              <w:t>0.00 km</w:t>
+              <w:t>3.40 km</w:t>
             </w:r>
           </w:p>
         </w:tc>
@@ -1631,7 +1631,7 @@
                 <w:color w:val="000000"/>
                 <w:sz w:val="19"/>
               </w:rPr>
-              <w:t>0分</w:t>
+              <w:t>63分 / 3.40km</w:t>
             </w:r>
           </w:p>
         </w:tc>
@@ -1658,7 +1658,7 @@
                 <w:color w:val="000000"/>
                 <w:sz w:val="19"/>
               </w:rPr>
-              <w:t>❌ 未執行/待排程</w:t>
+              <w:t>🟢 良好達標 (84%, A-)</w:t>
             </w:r>
           </w:p>
         </w:tc>
@@ -2515,11 +2515,23 @@
     </w:p>
     <w:p>
       <w:r>
-        <w:t>• 當週累積自行車 0.00 km、跑步 0.00 km、游泳 0.00 km，整體時間執行率達 0.0%。</w:t>
+        <w:t>• 當週累積自行車 0.00 km、跑步 0.00 km、游泳 3.40 km，整體時間執行率達 12.7%。</w:t>
         <w:br/>
       </w:r>
       <w:r>
-        <w:t>• 在高負荷訓練後無縫銜接轉換跑，並依據即時心率與體感自覺彈性調整，兼顧神經肌肉適應與傷害防範。</w:t>
+        <w:t>• Build 1-4 第一建構期減量調整週推進 (Deload &amp; Supercompensation Phase)：本週為第一建構期第四週，核心目標在於降低總訓練容量，促進神經系統深層修復與超量補償吸收。週一完全休息日充份修復後，今日 (9/22 週二) 順利高質量吃下 50m 長池「甜甜課表」3,400m！目前全週已累積游泳 3.40 km、自行車 0.00 km、跑步 0.00 km，三項總時長達 1.1 小時，整體時間執行率達 12.7%。</w:t>
+        <w:br/>
+      </w:r>
+      <w:r>
+        <w:t>• 週二晨間 50m 長池甜甜課表 3,400m (113.7 sTSS, IF 1.023) 頂尖長游：9/22 清晨 06:06 耗時 1 小時 03 分 41 秒完成 3,400 m（原定 75 分鐘，時間達成率 84.9%，sTSS 達 113.73，達成率 106.1% 超額精準完成）。全趟划水均速 1:52.8 /100m (標準化速度 1:52.4 /100m，均時速 3.19 km/h，精準切中 Sub-11 游泳 1h12m / 3.8km / 1:53/100m 目標配速線！)。全趟均心率僅 97 bpm (最低 69 bpm，最高 163 bpm，Recovery 與 Endurance 低心率區間佔比高達 97.7%)；均划頻 26 spm (最高 33 spm)；速度心率脫鉤率呈現極其驚人的負脫鉤 (Spd:HR -32.31%)，展現心肺完全零漂移與超高水準流線型 (Streamline) 推進經濟性！體感自覺給出良好的 3/5 與 RPE 3/10 (輕鬆省力巡航)。</w:t>
+        <w:br/>
+      </w:r>
+      <w:r>
+        <w:t>• 48 Laps 分段結構與速度亮點：包含 400m 熱身 (2:06/100m, HR 114)、8 組 50m Drill 技術分解 (合計 400m)、400m/450m/200m/250m 專項耐力長巡航 (開出 1:35~1:47/100m)，以及 8 組 100m 自由式配速間歇（快段均勻飆出 1:37~1:42/100m 絕佳配速）與 100m 緩和收操，水感流暢、核心穩定無下沉阻力！</w:t>
+        <w:br/>
+      </w:r>
+      <w:r>
+        <w:t>• 週一 Build 1-4 完全休息日 (Rest Day)：9/21 嚴格恪守減量週完全休息紀律，促進生長激素分泌以修復前三週累積之神經肌肉疲勞。</w:t>
         <w:br/>
       </w:r>
     </w:p>

</xml_diff>

<commit_message>
Auto Daily 8:00 PM Dashboard Update [2026-09-23 20:11]
</commit_message>
<xml_diff>
--- a/docs/weekly/2026-W39_當週執行率回顧報告.docx
+++ b/docs/weekly/2026-W39_當週執行率回顧報告.docx
@@ -21,7 +21,7 @@
           <w:color w:val="555555"/>
           <w:sz w:val="20"/>
         </w:rPr>
-        <w:t>週期：2026/09/21–2026/09/27　｜　整體時間執行率：12.7%</w:t>
+        <w:t>週期：2026/09/21–2026/09/27　｜　整體時間執行率：24.8%</w:t>
       </w:r>
     </w:p>
     <w:p>
@@ -783,7 +783,7 @@
                 <w:color w:val="000000"/>
                 <w:sz w:val="19"/>
               </w:rPr>
-              <w:t>0.00 hr</w:t>
+              <w:t>1.00 hr</w:t>
             </w:r>
           </w:p>
         </w:tc>
@@ -810,7 +810,7 @@
                 <w:color w:val="000000"/>
                 <w:sz w:val="19"/>
               </w:rPr>
-              <w:t>0.0%</w:t>
+              <w:t>44.4%</w:t>
             </w:r>
           </w:p>
         </w:tc>
@@ -864,7 +864,7 @@
                 <w:color w:val="000000"/>
                 <w:sz w:val="19"/>
               </w:rPr>
-              <w:t>0.00 km</w:t>
+              <w:t>9.53 km</w:t>
             </w:r>
           </w:p>
         </w:tc>
@@ -891,7 +891,7 @@
                 <w:color w:val="000000"/>
                 <w:sz w:val="19"/>
               </w:rPr>
-              <w:t>0.0%</w:t>
+              <w:t>108.3%</w:t>
             </w:r>
           </w:p>
         </w:tc>
@@ -1797,7 +1797,7 @@
                 <w:color w:val="000000"/>
                 <w:sz w:val="19"/>
               </w:rPr>
-              <w:t>0分</w:t>
+              <w:t>60分 / 9.53km</w:t>
             </w:r>
           </w:p>
         </w:tc>
@@ -1824,7 +1824,7 @@
                 <w:color w:val="000000"/>
                 <w:sz w:val="19"/>
               </w:rPr>
-              <w:t>❌ 未執行/待排程</w:t>
+              <w:t>✅ 精準達標 (100%, A+)</w:t>
             </w:r>
           </w:p>
         </w:tc>
@@ -2515,11 +2515,11 @@
     </w:p>
     <w:p>
       <w:r>
-        <w:t>• 當週累積自行車 0.00 km、跑步 0.00 km、游泳 3.40 km，整體時間執行率達 12.7%。</w:t>
+        <w:t>• 當週累積自行車 0.00 km、跑步 9.53 km、游泳 3.40 km，整體時間執行率達 24.8%。</w:t>
         <w:br/>
       </w:r>
       <w:r>
-        <w:t>• Build 1-4 第一建構期減量調整週推進 (Deload &amp; Supercompensation Phase)：本週為第一建構期第四週，核心目標在於降低總訓練容量，促進神經系統深層修復與超量補償吸收。週一完全休息日充份修復後，今日 (9/22 週二) 順利高質量吃下 50m 長池「甜甜課表」3,400m！目前全週已累積游泳 3.40 km、自行車 0.00 km、跑步 0.00 km，三項總時長達 1.1 小時，整體時間執行率達 12.7%。</w:t>
+        <w:t>• Build 1-4 第一建構期減量調整週推進 (Deload &amp; Supercompensation Phase)：本週為第一建構期第四週，核心目標在於降低總訓練容量，促進神經系統深層修復與超量補償吸收。週一完全休息日充份修復後，今日 (9/22 週二) 順利高質量吃下 50m 長池「甜甜課表」3,400m！目前全週已累積游泳 3.40 km、自行車 0.00 km、跑步 9.53 km，三項總時長達 2.0 小時，整體時間執行率達 24.8%。</w:t>
         <w:br/>
       </w:r>
       <w:r>

</xml_diff>

<commit_message>
feat: sync 2026-09-23 TP run workout (5x1200m track intervals) and update dashboard
</commit_message>
<xml_diff>
--- a/docs/weekly/2026-W39_當週執行率回顧報告.docx
+++ b/docs/weekly/2026-W39_當週執行率回顧報告.docx
@@ -2519,15 +2519,19 @@
         <w:br/>
       </w:r>
       <w:r>
-        <w:t>• Build 1-4 第一建構期減量調整週推進 (Deload &amp; Supercompensation Phase)：本週為第一建構期第四週，核心目標在於降低總訓練容量，促進神經系統深層修復與超量補償吸收。週一完全休息日充份修復後，今日 (9/22 週二) 順利高質量吃下 50m 長池「甜甜課表」3,400m！目前全週已累積游泳 3.40 km、自行車 0.00 km、跑步 9.53 km，三項總時長達 2.0 小時，整體時間執行率達 24.8%。</w:t>
+        <w:t>• Build 1-4 第一建構期減量調整週推進 (Deload &amp; Supercompensation Phase)：本週為第一建構期第四週，核心目標在於降低總訓練容量，促進神經系統深層修復與超量補償吸收。週一完全休息日充份修復後，週二 (9/22) 順利吃下 50m 長池「甜甜課表」3,400m，今日 (9/23 週三) 接續以高質量吃下田徑場 5x1200m 漸進間歇跑 9.53km！目前全週已累積游泳 3.40 km、自行車 0.00 km、跑步 9.53 km，三項總時長達 2.0 小時，整體時間執行率達 24.8%，雙項累積負荷斬獲 169.2 TSS。</w:t>
+        <w:br/>
+      </w:r>
+      <w:r>
+        <w:t>• 週三晨間田徑場 5x1200m 漸進速度間歇 9.53km (55.5 rTSS, IF 0.706) 頂尖跑步專項：9/23 清晨 05:51 耗時 1 小時 00 分 16 秒完成 9.53 km（原定 60 分鐘 / 8.8 km，時間達成率 100.4% 精準達標，距離達成率 108.3% 超額完成，收穫 55.48 rTSS）。全趟標準化速度 5:40 /km (直擊 Sub-11 全馬 4 小時 5:41/km 目標配速線！)，均速 6:20 /km (含熱身、組間走動慢跑恢復與緩和)，均瓦 242W (3.58 W/kg，最大 420W，做功 877 kJ)。全趟均心率 151 bpm (最高 183 bpm，低心率恢復與耐力區累積達 47 分鐘，佔比 77.8%)；均步頻 146 spm (間歇跑動段穩定高居 171~183 spm，最高 196 spm)；步態力學頂尖：平均觸地時間 251.2 ms (最優達 204 ms)，平均垂直比僅 8.0% (&lt;9% 頂尖跑者標竿，垂直振幅 8.16 cm、步幅 1.02m)，展現極致的能量向前推進效率與落地剛性！體感自覺給出良好的 3/5 與 RPE 4/10！</w:t>
+        <w:br/>
+      </w:r>
+      <w:r>
+        <w:t>• 26 Laps 分段結構與 5 組 1200m 負分割亮點：包含 1,000m 熱身跑 (6:46/km, HR 118) 與動態技術操，核心執行 5 組 1,200m 漸進間歇：第 1 組 (3x400m) @ 5:11/km (123~128s/400m) ➔ 第 2 組 (3x400m) @ 5:05/km (122~124s/400m) ➔ 第 3 組 (3x400m) @ 4:50/km (117~118s/400m) ➔ 第 4 組 (800m+400m) @ 4:38/km (112s/400m) ➔ 第 5 組 (3x400m) @ 4:29~4:23/km (108s, 110s, 106s / 400m！步頻飆上 183 spm)！組間規律 2 分鐘走動動態恢復（心率快速自 170+ bpm 回降至 125~135 bpm，展現極高心血管彈性與抗疲勞耐受力），最後以 1,377m 緩和收操！</w:t>
         <w:br/>
       </w:r>
       <w:r>
         <w:t>• 週二晨間 50m 長池甜甜課表 3,400m (113.7 sTSS, IF 1.023) 頂尖長游：9/22 清晨 06:06 耗時 1 小時 03 分 41 秒完成 3,400 m（原定 75 分鐘，時間達成率 84.9%，sTSS 達 113.73，達成率 106.1% 超額精準完成）。全趟划水均速 1:52.8 /100m (標準化速度 1:52.4 /100m，均時速 3.19 km/h，精準切中 Sub-11 游泳 1h12m / 3.8km / 1:53/100m 目標配速線！)。全趟均心率僅 97 bpm (最低 69 bpm，最高 163 bpm，Recovery 與 Endurance 低心率區間佔比高達 97.7%)；均划頻 26 spm (最高 33 spm)；速度心率脫鉤率呈現極其驚人的負脫鉤 (Spd:HR -32.31%)，展現心肺完全零漂移與超高水準流線型 (Streamline) 推進經濟性！體感自覺給出良好的 3/5 與 RPE 3/10 (輕鬆省力巡航)。</w:t>
-        <w:br/>
-      </w:r>
-      <w:r>
-        <w:t>• 48 Laps 分段結構與速度亮點：包含 400m 熱身 (2:06/100m, HR 114)、8 組 50m Drill 技術分解 (合計 400m)、400m/450m/200m/250m 專項耐力長巡航 (開出 1:35~1:47/100m)，以及 8 組 100m 自由式配速間歇（快段均勻飆出 1:37~1:42/100m 絕佳配速）與 100m 緩和收操，水感流暢、核心穩定無下沉阻力！</w:t>
         <w:br/>
       </w:r>
       <w:r>

</xml_diff>

<commit_message>
Auto Daily 8:00 PM Dashboard Update [2026-09-24 20:00]
</commit_message>
<xml_diff>
--- a/docs/weekly/2026-W39_當週執行率回顧報告.docx
+++ b/docs/weekly/2026-W39_當週執行率回顧報告.docx
@@ -21,7 +21,7 @@
           <w:color w:val="555555"/>
           <w:sz w:val="20"/>
         </w:rPr>
-        <w:t>週期：2026/09/21–2026/09/27　｜　整體時間執行率：24.8%</w:t>
+        <w:t>週期：2026/09/21–2026/09/27　｜　整體時間執行率：37.6%</w:t>
       </w:r>
     </w:p>
     <w:p>
@@ -347,7 +347,7 @@
                 <w:color w:val="000000"/>
                 <w:sz w:val="19"/>
               </w:rPr>
-              <w:t>1.05 hr</w:t>
+              <w:t>2.10 hr</w:t>
             </w:r>
           </w:p>
         </w:tc>
@@ -374,7 +374,7 @@
                 <w:color w:val="000000"/>
                 <w:sz w:val="19"/>
               </w:rPr>
-              <w:t>42.0%</w:t>
+              <w:t>84.0%</w:t>
             </w:r>
           </w:p>
         </w:tc>
@@ -428,7 +428,7 @@
                 <w:color w:val="000000"/>
                 <w:sz w:val="19"/>
               </w:rPr>
-              <w:t>3.40 km</w:t>
+              <w:t>6.65 km</w:t>
             </w:r>
           </w:p>
         </w:tc>
@@ -1963,7 +1963,7 @@
                 <w:color w:val="000000"/>
                 <w:sz w:val="19"/>
               </w:rPr>
-              <w:t>0分</w:t>
+              <w:t>63分 / 3.25km</w:t>
             </w:r>
           </w:p>
         </w:tc>
@@ -1990,7 +1990,7 @@
                 <w:color w:val="000000"/>
                 <w:sz w:val="19"/>
               </w:rPr>
-              <w:t>❌ 未執行/待排程</w:t>
+              <w:t>🟢 良好達標 (84%, A-)</w:t>
             </w:r>
           </w:p>
         </w:tc>
@@ -2515,11 +2515,11 @@
     </w:p>
     <w:p>
       <w:r>
-        <w:t>• 當週累積自行車 0.00 km、跑步 9.53 km、游泳 3.40 km，整體時間執行率達 24.8%。</w:t>
+        <w:t>• 當週累積自行車 0.00 km、跑步 9.53 km、游泳 6.65 km，整體時間執行率達 37.6%。</w:t>
         <w:br/>
       </w:r>
       <w:r>
-        <w:t>• Build 1-4 第一建構期減量調整週推進 (Deload &amp; Supercompensation Phase)：本週為第一建構期第四週，核心目標在於降低總訓練容量，促進神經系統深層修復與超量補償吸收。週一完全休息日充份修復後，週二 (9/22) 順利吃下 50m 長池「甜甜課表」3,400m，今日 (9/23 週三) 接續以高質量吃下田徑場 5x1200m 漸進間歇跑 9.53km！目前全週已累積游泳 3.40 km、自行車 0.00 km、跑步 9.53 km，三項總時長達 2.0 小時，整體時間執行率達 24.8%，雙項累積負荷斬獲 169.2 TSS。</w:t>
+        <w:t>• Build 1-4 第一建構期減量調整週推進 (Deload &amp; Supercompensation Phase)：本週為第一建構期第四週，核心目標在於降低總訓練容量，促進神經系統深層修復與超量補償吸收。週一完全休息日充份修復後，週二 (9/22) 順利吃下 50m 長池「甜甜課表」3,400m，今日 (9/23 週三) 接續以高質量吃下田徑場 5x1200m 漸進間歇跑 9.53km！目前全週已累積游泳 6.65 km、自行車 0.00 km、跑步 9.53 km，三項總時長達 3.1 小時，整體時間執行率達 37.6%，雙項累積負荷斬獲 169.2 TSS。</w:t>
         <w:br/>
       </w:r>
       <w:r>

</xml_diff>

<commit_message>
feat: sync 2026-09-24 TP swim workout (3250m sweet spot) and update dashboard
</commit_message>
<xml_diff>
--- a/docs/weekly/2026-W39_當週執行率回顧報告.docx
+++ b/docs/weekly/2026-W39_當週執行率回顧報告.docx
@@ -2519,19 +2519,19 @@
         <w:br/>
       </w:r>
       <w:r>
-        <w:t>• Build 1-4 第一建構期減量調整週推進 (Deload &amp; Supercompensation Phase)：本週為第一建構期第四週，核心目標在於降低總訓練容量，促進神經系統深層修復與超量補償吸收。週一完全休息日充份修復後，週二 (9/22) 順利吃下 50m 長池「甜甜課表」3,400m，今日 (9/23 週三) 接續以高質量吃下田徑場 5x1200m 漸進間歇跑 9.53km！目前全週已累積游泳 6.65 km、自行車 0.00 km、跑步 9.53 km，三項總時長達 3.1 小時，整體時間執行率達 37.6%，雙項累積負荷斬獲 169.2 TSS。</w:t>
+        <w:t>• Build 1-4 第一建構期減量調整週推進 (Deload &amp; Supercompensation Phase)：本週為第一建構期第四週，核心目標在於降低總訓練容量，促進神經系統深層修復與超量補償吸收。週一完全休息日充份修復後，週二 (9/22) 順利吃下 50m 長池「甜甜課表」3,400m，週三 (9/23) 接續以高質量吃下田徑場 5x1200m 漸進間歇跑 9.53km，今日 (9/24 週四) 再度高水準吃下 50m 長池「甜甜課表」3,250m！目前全週已累積游泳 6.65 km、自行車 0.00 km、跑步 9.53 km，三項總時長達 3.1 小時，整體時間執行率達 37.6%，三項累積負荷斬獲 268.7 TSS。</w:t>
         <w:br/>
       </w:r>
       <w:r>
-        <w:t>• 週三晨間田徑場 5x1200m 漸進速度間歇 9.53km (55.5 rTSS, IF 0.706) 頂尖跑步專項：9/23 清晨 05:51 耗時 1 小時 00 分 16 秒完成 9.53 km（原定 60 分鐘 / 8.8 km，時間達成率 100.4% 精準達標，距離達成率 108.3% 超額完成，收穫 55.48 rTSS）。全趟標準化速度 5:40 /km (直擊 Sub-11 全馬 4 小時 5:41/km 目標配速線！)，均速 6:20 /km (含熱身、組間走動慢跑恢復與緩和)，均瓦 242W (3.58 W/kg，最大 420W，做功 877 kJ)。全趟均心率 151 bpm (最高 183 bpm，低心率恢復與耐力區累積達 47 分鐘，佔比 77.8%)；均步頻 146 spm (間歇跑動段穩定高居 171~183 spm，最高 196 spm)；步態力學頂尖：平均觸地時間 251.2 ms (最優達 204 ms)，平均垂直比僅 8.0% (&lt;9% 頂尖跑者標竿，垂直振幅 8.16 cm、步幅 1.02m)，展現極致的能量向前推進效率與落地剛性！體感自覺給出良好的 3/5 與 RPE 4/10！</w:t>
+        <w:t>• 週四晨間 50m 長池甜甜課表 3,250m (99.5 sTSS, IF 0.979) 頂尖長游：9/24 清晨 06:05 耗時 1 小時 03 分 37 秒完成 3,250 m（原定 75 分鐘，實游距離達標，sTSS 達 99.52）。全趟划水均速 1:57.8 /100m (標準化速度 1:57.4 /100m，均時速 3.06 km/h)；均心率僅 117 bpm (最高 190 bpm，低心率 Recovery 與 Endurance 區間佔比高達 86.2%)；均划頻 27 spm (最高 36 spm)；速度心率脫鉤率呈現極其驚人的負脫鉤 (Spd:HR -26.66%)！核心巡航亮點：400m 自由式巡航開出 1:40.0 /100m 整 (均心率僅 96 bpm！)、850m 長巡航游出 1:43.4 /100m (均心率僅 115 bpm！)，體感自覺給出良好的 3/5 與 RPE 5/10！在昨日 9.53km 高強度間歇跑後，成功善用長池水壓與浮力達成下肢深層動態排酸。</w:t>
         <w:br/>
       </w:r>
       <w:r>
-        <w:t>• 26 Laps 分段結構與 5 組 1200m 負分割亮點：包含 1,000m 熱身跑 (6:46/km, HR 118) 與動態技術操，核心執行 5 組 1,200m 漸進間歇：第 1 組 (3x400m) @ 5:11/km (123~128s/400m) ➔ 第 2 組 (3x400m) @ 5:05/km (122~124s/400m) ➔ 第 3 組 (3x400m) @ 4:50/km (117~118s/400m) ➔ 第 4 組 (800m+400m) @ 4:38/km (112s/400m) ➔ 第 5 組 (3x400m) @ 4:29~4:23/km (108s, 110s, 106s / 400m！步頻飆上 183 spm)！組間規律 2 分鐘走動動態恢復（心率快速自 170+ bpm 回降至 125~135 bpm，展現極高心血管彈性與抗疲勞耐受力），最後以 1,377m 緩和收操！</w:t>
+        <w:t>• 週三晨間田徑場 5x1200m 漸進速度間歇 9.53km (55.5 rTSS, IF 0.706) 頂尖跑步專項：9/23 清晨 05:51 耗時 1 小時 00 分 16 秒完成 9.53 km（原定 60 分鐘 / 8.8 km，時間達成率 100.4% 精準達標，距離達成率 108.3% 超額完成，收穫 55.48 rTSS）。全趟標準化速度 5:40 /km (直擊 Sub-11 全馬 4 小時 5:41/km 目標配速線！)，均速 6:20 /km，均瓦 242W (3.58 W/kg，最大 420W)。全趟均心率 151 bpm (最高 183 bpm)；均步頻 146 spm (間歇跑動段 171~183 spm)；步態力學頂尖：觸地時間 251.2 ms，垂直比僅 8.0% (&lt;9% 頂尖標竿，振幅 8.16cm、步幅 1.02m)，展現頂級能量轉換經濟性；核心 5 組 1200m 負分割間歇末圈開出 4:23/km (步頻 183 spm)！</w:t>
         <w:br/>
       </w:r>
       <w:r>
-        <w:t>• 週二晨間 50m 長池甜甜課表 3,400m (113.7 sTSS, IF 1.023) 頂尖長游：9/22 清晨 06:06 耗時 1 小時 03 分 41 秒完成 3,400 m（原定 75 分鐘，時間達成率 84.9%，sTSS 達 113.73，達成率 106.1% 超額精準完成）。全趟划水均速 1:52.8 /100m (標準化速度 1:52.4 /100m，均時速 3.19 km/h，精準切中 Sub-11 游泳 1h12m / 3.8km / 1:53/100m 目標配速線！)。全趟均心率僅 97 bpm (最低 69 bpm，最高 163 bpm，Recovery 與 Endurance 低心率區間佔比高達 97.7%)；均划頻 26 spm (最高 33 spm)；速度心率脫鉤率呈現極其驚人的負脫鉤 (Spd:HR -32.31%)，展現心肺完全零漂移與超高水準流線型 (Streamline) 推進經濟性！體感自覺給出良好的 3/5 與 RPE 3/10 (輕鬆省力巡航)。</w:t>
+        <w:t>• 週二晨間 50m 長池甜甜課表 3,400m (113.7 sTSS, IF 1.023) 頂尖長游：9/22 清晨 06:06 耗時 1 小時 03 分 41 秒完成 3,400 m（sTSS 達 113.73，達成率 106.1%）。全趟划水均速 1:52.8 /100m (標準化速度 1:52.4 /100m，精準切中 Sub-11 游泳 1h12m 目標線！)。均心率僅 97 bpm，速度心率脫鉤率 Spd:HR -32.31%，流線型與抗疲勞水感卓越！</w:t>
         <w:br/>
       </w:r>
       <w:r>

</xml_diff>

<commit_message>
Auto Daily 8:00 PM Dashboard Update [2026-09-25 20:01]
</commit_message>
<xml_diff>
--- a/docs/weekly/2026-W39_當週執行率回顧報告.docx
+++ b/docs/weekly/2026-W39_當週執行率回顧報告.docx
@@ -21,7 +21,7 @@
           <w:color w:val="555555"/>
           <w:sz w:val="20"/>
         </w:rPr>
-        <w:t>週期：2026/09/21–2026/09/27　｜　整體時間執行率：37.6%</w:t>
+        <w:t>週期：2026/09/21–2026/09/27　｜　整體時間執行率：71.1%</w:t>
       </w:r>
     </w:p>
     <w:p>
@@ -565,7 +565,7 @@
                 <w:color w:val="000000"/>
                 <w:sz w:val="19"/>
               </w:rPr>
-              <w:t>0.00 hr</w:t>
+              <w:t>2.77 hr</w:t>
             </w:r>
           </w:p>
         </w:tc>
@@ -592,7 +592,7 @@
                 <w:color w:val="000000"/>
                 <w:sz w:val="19"/>
               </w:rPr>
-              <w:t>0.0%</w:t>
+              <w:t>79.0%</w:t>
             </w:r>
           </w:p>
         </w:tc>
@@ -646,7 +646,7 @@
                 <w:color w:val="000000"/>
                 <w:sz w:val="19"/>
               </w:rPr>
-              <w:t>0.00 km</w:t>
+              <w:t>71.61 km</w:t>
             </w:r>
           </w:p>
         </w:tc>
@@ -673,7 +673,7 @@
                 <w:color w:val="000000"/>
                 <w:sz w:val="19"/>
               </w:rPr>
-              <w:t>0.0%</w:t>
+              <w:t>95.5%</w:t>
             </w:r>
           </w:p>
         </w:tc>
@@ -2129,7 +2129,7 @@
                 <w:color w:val="000000"/>
                 <w:sz w:val="19"/>
               </w:rPr>
-              <w:t>0分</w:t>
+              <w:t>166分 / 71.61km</w:t>
             </w:r>
           </w:p>
         </w:tc>
@@ -2156,7 +2156,7 @@
                 <w:color w:val="000000"/>
                 <w:sz w:val="19"/>
               </w:rPr>
-              <w:t>❌ 未執行/待排程</w:t>
+              <w:t>⚡ 超額完成 (111%, A)</w:t>
             </w:r>
           </w:p>
         </w:tc>
@@ -2515,11 +2515,11 @@
     </w:p>
     <w:p>
       <w:r>
-        <w:t>• 當週累積自行車 0.00 km、跑步 9.53 km、游泳 6.65 km，整體時間執行率達 37.6%。</w:t>
+        <w:t>• 當週累積自行車 71.61 km、跑步 9.53 km、游泳 6.65 km，整體時間執行率達 71.1%。</w:t>
         <w:br/>
       </w:r>
       <w:r>
-        <w:t>• Build 1-4 第一建構期減量調整週推進 (Deload &amp; Supercompensation Phase)：本週為第一建構期第四週，核心目標在於降低總訓練容量，促進神經系統深層修復與超量補償吸收。週一完全休息日充份修復後，週二 (9/22) 順利吃下 50m 長池「甜甜課表」3,400m，週三 (9/23) 接續以高質量吃下田徑場 5x1200m 漸進間歇跑 9.53km，今日 (9/24 週四) 再度高水準吃下 50m 長池「甜甜課表」3,250m！目前全週已累積游泳 6.65 km、自行車 0.00 km、跑步 9.53 km，三項總時長達 3.1 小時，整體時間執行率達 37.6%，三項累積負荷斬獲 268.7 TSS。</w:t>
+        <w:t>• Build 1-4 第一建構期減量調整週推進 (Deload &amp; Supercompensation Phase)：本週為第一建構期第四週，核心目標在於降低總訓練容量，促進神經系統深層修復與超量補償吸收。週一完全休息日充份修復後，週二 (9/22) 順利吃下 50m 長池「甜甜課表」3,400m，週三 (9/23) 接續以高質量吃下田徑場 5x1200m 漸進間歇跑 9.53km，今日 (9/24 週四) 再度高水準吃下 50m 長池「甜甜課表」3,250m！目前全週已累積游泳 6.65 km、自行車 71.61 km、跑步 9.53 km，三項總時長達 5.9 小時，整體時間執行率達 71.1%，三項累積負荷斬獲 268.7 TSS。</w:t>
         <w:br/>
       </w:r>
       <w:r>

</xml_diff>

<commit_message>
Auto Daily 8:00 PM Dashboard Update [2026-09-26 21:34]
</commit_message>
<xml_diff>
--- a/docs/weekly/2026-W39_當週執行率回顧報告.docx
+++ b/docs/weekly/2026-W39_當週執行率回顧報告.docx
@@ -21,7 +21,7 @@
           <w:color w:val="555555"/>
           <w:sz w:val="20"/>
         </w:rPr>
-        <w:t>週期：2026/09/21–2026/09/27　｜　整體時間執行率：71.1%</w:t>
+        <w:t>週期：2026/09/21–2026/09/27　｜　整體時間執行率：107.9%</w:t>
       </w:r>
     </w:p>
     <w:p>
@@ -565,7 +565,7 @@
                 <w:color w:val="000000"/>
                 <w:sz w:val="19"/>
               </w:rPr>
-              <w:t>2.77 hr</w:t>
+              <w:t>4.45 hr</w:t>
             </w:r>
           </w:p>
         </w:tc>
@@ -592,7 +592,7 @@
                 <w:color w:val="000000"/>
                 <w:sz w:val="19"/>
               </w:rPr>
-              <w:t>79.0%</w:t>
+              <w:t>127.1%</w:t>
             </w:r>
           </w:p>
         </w:tc>
@@ -646,7 +646,7 @@
                 <w:color w:val="000000"/>
                 <w:sz w:val="19"/>
               </w:rPr>
-              <w:t>71.61 km</w:t>
+              <w:t>108.97 km</w:t>
             </w:r>
           </w:p>
         </w:tc>
@@ -673,7 +673,7 @@
                 <w:color w:val="000000"/>
                 <w:sz w:val="19"/>
               </w:rPr>
-              <w:t>95.5%</w:t>
+              <w:t>145.3%</w:t>
             </w:r>
           </w:p>
         </w:tc>
@@ -756,7 +756,7 @@
                 <w:color w:val="000000"/>
                 <w:sz w:val="19"/>
               </w:rPr>
-              <w:t>2.25 hr</w:t>
+              <w:t>1.00 hr</w:t>
             </w:r>
           </w:p>
         </w:tc>
@@ -810,7 +810,7 @@
                 <w:color w:val="000000"/>
                 <w:sz w:val="19"/>
               </w:rPr>
-              <w:t>44.4%</w:t>
+              <w:t>100.0%</w:t>
             </w:r>
           </w:p>
         </w:tc>
@@ -918,7 +918,7 @@
                 <w:color w:val="000000"/>
                 <w:sz w:val="19"/>
               </w:rPr>
-              <w:t>2</w:t>
+              <w:t>1</w:t>
             </w:r>
           </w:p>
         </w:tc>
@@ -2295,7 +2295,7 @@
                 <w:color w:val="000000"/>
                 <w:sz w:val="19"/>
               </w:rPr>
-              <w:t>0分</w:t>
+              <w:t>101分 / 37.36km</w:t>
             </w:r>
           </w:p>
         </w:tc>
@@ -2322,173 +2322,7 @@
                 <w:color w:val="000000"/>
                 <w:sz w:val="19"/>
               </w:rPr>
-              <w:t>❌ 未執行/待排程</w:t>
-            </w:r>
-          </w:p>
-        </w:tc>
-      </w:tr>
-      <w:tr>
-        <w:tc>
-          <w:tcPr>
-            <w:tcW w:type="dxa" w:w="1050"/>
-            <w:tcMar>
-              <w:top w:w="80" w:type="dxa"/>
-              <w:start w:w="120" w:type="dxa"/>
-              <w:bottom w:w="80" w:type="dxa"/>
-              <w:end w:w="120" w:type="dxa"/>
-            </w:tcMar>
-            <w:vAlign w:val="center"/>
-          </w:tcPr>
-          <w:p>
-            <w:pPr>
-              <w:spacing w:after="0"/>
-              <w:jc w:val="center"/>
-            </w:pPr>
-            <w:r>
-              <w:rPr>
-                <w:rFonts w:ascii="Calibri" w:hAnsi="Calibri" w:eastAsia="Microsoft JhengHei"/>
-                <w:b w:val="0"/>
-                <w:color w:val="000000"/>
-                <w:sz w:val="19"/>
-              </w:rPr>
-              <w:t>09/27</w:t>
-              <w:br/>
-              <w:t>週日</w:t>
-            </w:r>
-          </w:p>
-        </w:tc>
-        <w:tc>
-          <w:tcPr>
-            <w:tcW w:type="dxa" w:w="2750"/>
-            <w:tcMar>
-              <w:top w:w="80" w:type="dxa"/>
-              <w:start w:w="120" w:type="dxa"/>
-              <w:bottom w:w="80" w:type="dxa"/>
-              <w:end w:w="120" w:type="dxa"/>
-            </w:tcMar>
-            <w:vAlign w:val="center"/>
-          </w:tcPr>
-          <w:p>
-            <w:pPr>
-              <w:spacing w:after="0"/>
-              <w:jc w:val="left"/>
-            </w:pPr>
-            <w:r>
-              <w:rPr>
-                <w:rFonts w:ascii="Calibri" w:hAnsi="Calibri" w:eastAsia="Microsoft JhengHei"/>
-                <w:b w:val="0"/>
-                <w:color w:val="000000"/>
-                <w:sz w:val="19"/>
-              </w:rPr>
-              <w:t>Run: EASY</w:t>
-            </w:r>
-          </w:p>
-        </w:tc>
-        <w:tc>
-          <w:tcPr>
-            <w:tcW w:type="dxa" w:w="1050"/>
-            <w:tcMar>
-              <w:top w:w="80" w:type="dxa"/>
-              <w:start w:w="120" w:type="dxa"/>
-              <w:bottom w:w="80" w:type="dxa"/>
-              <w:end w:w="120" w:type="dxa"/>
-            </w:tcMar>
-            <w:vAlign w:val="center"/>
-          </w:tcPr>
-          <w:p>
-            <w:pPr>
-              <w:spacing w:after="0"/>
-              <w:jc w:val="center"/>
-            </w:pPr>
-            <w:r>
-              <w:rPr>
-                <w:rFonts w:ascii="Calibri" w:hAnsi="Calibri" w:eastAsia="Microsoft JhengHei"/>
-                <w:b w:val="0"/>
-                <w:color w:val="000000"/>
-                <w:sz w:val="19"/>
-              </w:rPr>
-              <w:t>Run</w:t>
-            </w:r>
-          </w:p>
-        </w:tc>
-        <w:tc>
-          <w:tcPr>
-            <w:tcW w:type="dxa" w:w="1500"/>
-            <w:tcMar>
-              <w:top w:w="80" w:type="dxa"/>
-              <w:start w:w="120" w:type="dxa"/>
-              <w:bottom w:w="80" w:type="dxa"/>
-              <w:end w:w="120" w:type="dxa"/>
-            </w:tcMar>
-            <w:vAlign w:val="center"/>
-          </w:tcPr>
-          <w:p>
-            <w:pPr>
-              <w:spacing w:after="0"/>
-              <w:jc w:val="center"/>
-            </w:pPr>
-            <w:r>
-              <w:rPr>
-                <w:rFonts w:ascii="Calibri" w:hAnsi="Calibri" w:eastAsia="Microsoft JhengHei"/>
-                <w:b w:val="0"/>
-                <w:color w:val="000000"/>
-                <w:sz w:val="19"/>
-              </w:rPr>
-              <w:t>75分</w:t>
-            </w:r>
-          </w:p>
-        </w:tc>
-        <w:tc>
-          <w:tcPr>
-            <w:tcW w:type="dxa" w:w="1500"/>
-            <w:tcMar>
-              <w:top w:w="80" w:type="dxa"/>
-              <w:start w:w="120" w:type="dxa"/>
-              <w:bottom w:w="80" w:type="dxa"/>
-              <w:end w:w="120" w:type="dxa"/>
-            </w:tcMar>
-            <w:vAlign w:val="center"/>
-          </w:tcPr>
-          <w:p>
-            <w:pPr>
-              <w:spacing w:after="0"/>
-              <w:jc w:val="center"/>
-            </w:pPr>
-            <w:r>
-              <w:rPr>
-                <w:rFonts w:ascii="Calibri" w:hAnsi="Calibri" w:eastAsia="Microsoft JhengHei"/>
-                <w:b w:val="0"/>
-                <w:color w:val="000000"/>
-                <w:sz w:val="19"/>
-              </w:rPr>
-              <w:t>0分</w:t>
-            </w:r>
-          </w:p>
-        </w:tc>
-        <w:tc>
-          <w:tcPr>
-            <w:tcW w:type="dxa" w:w="1810"/>
-            <w:tcMar>
-              <w:top w:w="80" w:type="dxa"/>
-              <w:start w:w="120" w:type="dxa"/>
-              <w:bottom w:w="80" w:type="dxa"/>
-              <w:end w:w="120" w:type="dxa"/>
-            </w:tcMar>
-            <w:vAlign w:val="center"/>
-          </w:tcPr>
-          <w:p>
-            <w:pPr>
-              <w:spacing w:after="0"/>
-              <w:jc w:val="center"/>
-            </w:pPr>
-            <w:r>
-              <w:rPr>
-                <w:rFonts w:ascii="Calibri" w:hAnsi="Calibri" w:eastAsia="Microsoft JhengHei"/>
-                <w:b w:val="0"/>
-                <w:color w:val="000000"/>
-                <w:sz w:val="19"/>
-              </w:rPr>
-              <w:t>❌ 未執行/待排程</w:t>
+              <w:t>⚡ 超額完成 (168%, A)</w:t>
             </w:r>
           </w:p>
         </w:tc>
@@ -2515,11 +2349,11 @@
     </w:p>
     <w:p>
       <w:r>
-        <w:t>• 當週累積自行車 71.61 km、跑步 9.53 km、游泳 6.65 km，整體時間執行率達 71.1%。</w:t>
+        <w:t>• 當週累積自行車 108.97 km、跑步 9.53 km、游泳 6.65 km，整體時間執行率達 107.9%。</w:t>
         <w:br/>
       </w:r>
       <w:r>
-        <w:t>• Build 1-4 第一建構期減量調整週推進 (Deload &amp; Supercompensation Phase)：本週為第一建構期第四週，核心目標在於降低總訓練容量，促進神經系統深層修復與超量補償吸收。週一完全休息日充份修復後，週二 (9/22) 順利吃下 50m 長池「甜甜課表」3,400m，週三 (9/23) 接續以高質量吃下田徑場 5x1200m 漸進間歇跑 9.53km，今日 (9/24 週四) 再度高水準吃下 50m 長池「甜甜課表」3,250m！目前全週已累積游泳 6.65 km、自行車 71.61 km、跑步 9.53 km，三項總時長達 5.9 小時，整體時間執行率達 71.1%，三項累積負荷斬獲 268.7 TSS。</w:t>
+        <w:t>• Build 1-4 第一建構期減量調整週推進 (Deload &amp; Supercompensation Phase)：本週為第一建構期第四週，核心目標在於降低總訓練容量，促進神經系統深層修復與超量補償吸收。週一完全休息日充份修復後，週二 (9/22) 順利吃下 50m 長池「甜甜課表」3,400m，週三 (9/23) 接續以高質量吃下田徑場 5x1200m 漸進間歇跑 9.53km，今日 (9/24 週四) 再度高水準吃下 50m 長池「甜甜課表」3,250m！目前全週已累積游泳 6.65 km、自行車 108.97 km、跑步 9.53 km，三項總時長達 7.5 小時，整體時間執行率達 107.9%，三項累積負荷斬獲 268.7 TSS。</w:t>
         <w:br/>
       </w:r>
       <w:r>

</xml_diff>